<commit_message>
API bàn giao DO cho hệ kế toán anh Tune (đúng khuôn EPL_System)
- GET /api/handover/delivery-orders và /{do_id}: chỉ phiếu đã về, đã
  khoá; do_id = EPLLAO-<Trip.id>; header + dòng thu 1211/708 + từng dòng
  chi kèm định khoản thật; xe thuê có khối hire (mã chờ anh Khampla).
- Khoá máy riêng token_nhan_qlsx (Bearer), Sếp tạo; kế toán xem trước gói.
- Bộ kiểm kiem/thu_ban_giao.py (31 chỗ, đạt trên bản sao DB).
- Hợp đồng anh Tune mục 12.8; sửa tài liệu: kho dùng API riêng anh Toàn.

Co-Authored-By: Claude Opus 5.5 (1M context) <noreply@anthropic.com>
</commit_message>
<xml_diff>
--- a/DOCS/word/DOI_CHIEU_API_HAI_ANH_30_09.docx
+++ b/DOCS/word/DOI_CHIEU_API_HAI_ANH_30_09.docx
@@ -459,25 +459,42 @@
         <w:jc w:val="both"/>
       </w:pPr>
       <w:r>
-        <w:t xml:space="preserve">Vậy nếu anh Toàn đồng ý, </w:t>
+        <w:rPr>
+          <w:b/>
+        </w:rPr>
+        <w:t>Anh chốt 30/09: kho dùng API RIÊNG của anh Toàn</w:t>
+      </w:r>
+      <w:r>
+        <w:t xml:space="preserve">, không nối vào phần kho trên máy anh Tune. Phần kho trên </w:t>
+      </w:r>
+      <w:r>
+        <w:rPr>
+          <w:rFonts w:ascii="Consolas" w:hAnsi="Consolas"/>
+          <w:sz w:val="19"/>
+        </w:rPr>
+        <w:t>demo-lao-api</w:t>
+      </w:r>
+      <w:r>
+        <w:t xml:space="preserve"> bên mình chỉ dùng để tham khảo khuôn trả về. Máy </w:t>
+      </w:r>
+      <w:r>
+        <w:rPr>
+          <w:rFonts w:ascii="Consolas" w:hAnsi="Consolas"/>
+          <w:sz w:val="19"/>
+        </w:rPr>
+        <w:t>demo-lao-api</w:t>
+      </w:r>
+      <w:r>
+        <w:t xml:space="preserve"> chỉ dùng cho </w:t>
       </w:r>
       <w:r>
         <w:rPr>
           <w:b/>
         </w:rPr>
-        <w:t>cả kế toán lẫn kho có thể nằm chung một máy Lào</w:t>
+        <w:t>kế toán / công nợ / thu chi của anh Tune</w:t>
       </w:r>
       <w:r>
-        <w:t xml:space="preserve">, dùng chung một token và một danh mục đối tượng. Việc còn lại chủ yếu là </w:t>
-      </w:r>
-      <w:r>
-        <w:rPr>
-          <w:b/>
-        </w:rPr>
-        <w:t>dựng dữ liệu cho EPL Lào</w:t>
-      </w:r>
-      <w:r>
-        <w:t xml:space="preserve"> trên máy đó.</w:t>
+        <w:t xml:space="preserve"> — làm phần này trước.</w:t>
       </w:r>
     </w:p>
     <w:p>
@@ -1728,7 +1745,7 @@
         <w:rPr>
           <w:color w:val="145C4A"/>
         </w:rPr>
-        <w:t>4. Anh Toàn cần làm (phần kho trên cùng máy Lào)</w:t>
+        <w:t>4. Anh Toàn cần làm (trên API kho riêng của anh ấy)</w:t>
       </w:r>
     </w:p>
     <w:tbl>
@@ -1834,7 +1851,17 @@
           <w:p>
             <w:r/>
             <w:r>
-              <w:t xml:space="preserve">máy Lào chỉ có kho của nhà máy giấy (Kho giấy cuộn, giấy tấm, vật tư, thành phẩm, hàng hoá, tem in) và các kho </w:t>
+              <w:t xml:space="preserve">(tham khảo) máy </w:t>
+            </w:r>
+            <w:r>
+              <w:rPr>
+                <w:rFonts w:ascii="Consolas" w:hAnsi="Consolas"/>
+                <w:sz w:val="19"/>
+              </w:rPr>
+              <w:t>demo-lao-api</w:t>
+            </w:r>
+            <w:r>
+              <w:t xml:space="preserve"> chỉ có kho của nhà máy giấy (Kho giấy cuộn, giấy tấm, vật tư, thành phẩm, hàng hoá, tem in) và các kho </w:t>
             </w:r>
             <w:r>
               <w:rPr>
@@ -2232,7 +2259,21 @@
         <w:pStyle w:val="ListBullet"/>
       </w:pPr>
       <w:r>
-        <w:t xml:space="preserve">Nếu nối vào </w:t>
+        <w:rPr>
+          <w:b/>
+        </w:rPr>
+        <w:t>Anh chốt: bên mình nối kho vào bản riêng này.</w:t>
+      </w:r>
+      <w:r>
+        <w:t xml:space="preserve"> Máy chạy và DB bên Lào anh chốt với anh Toàn. Em không tự dựng, không trỏ DB.</w:t>
+      </w:r>
+    </w:p>
+    <w:p>
+      <w:pPr>
+        <w:pStyle w:val="ListBullet"/>
+      </w:pPr>
+      <w:r>
+        <w:t xml:space="preserve">Các ID kho ở mục này là của máy </w:t>
       </w:r>
       <w:r>
         <w:rPr>
@@ -2242,49 +2283,7 @@
         <w:t>demo-lao-api</w:t>
       </w:r>
       <w:r>
-        <w:t xml:space="preserve"> thì </w:t>
-      </w:r>
-      <w:r>
-        <w:rPr>
-          <w:b/>
-        </w:rPr>
-        <w:t>không phải dựng thêm một máy nữa</w:t>
-      </w:r>
-      <w:r>
-        <w:t>. Anh Toàn chỉ cần:</w:t>
-      </w:r>
-    </w:p>
-    <w:p>
-      <w:pPr>
-        <w:jc w:val="both"/>
-      </w:pPr>
-      <w:r>
-        <w:t>- bổ sung thủ tục lưu và dữ liệu vào DB của máy đó;</w:t>
-      </w:r>
-    </w:p>
-    <w:p>
-      <w:pPr>
-        <w:jc w:val="both"/>
-      </w:pPr>
-      <w:r>
-        <w:t>- mang sang những đường còn thiếu nếu bên anh ấy cần (luồng bảng tạm, bước điều chỉnh sau kiểm kho).</w:t>
-      </w:r>
-    </w:p>
-    <w:p>
-      <w:pPr>
-        <w:pStyle w:val="ListBullet"/>
-      </w:pPr>
-      <w:r>
-        <w:t xml:space="preserve">Chọn máy nào là việc </w:t>
-      </w:r>
-      <w:r>
-        <w:rPr>
-          <w:b/>
-        </w:rPr>
-        <w:t>anh chốt với anh Toàn</w:t>
-      </w:r>
-      <w:r>
-        <w:t>. Em không tự dựng, không trỏ DB bản nào.</w:t>
+        <w:t>, chỉ để tham khảo. Trên hệ anh Toàn, ID có thể khác.</w:t>
       </w:r>
     </w:p>
     <w:p>
@@ -2810,51 +2809,16 @@
         <w:pStyle w:val="ListNumber"/>
       </w:pPr>
       <w:r>
+        <w:t xml:space="preserve">~~Kho nối vào máy nào~~ — </w:t>
+      </w:r>
+      <w:r>
         <w:rPr>
           <w:b/>
         </w:rPr>
-        <w:t>Kho nối vào máy nào:</w:t>
-      </w:r>
-    </w:p>
-    <w:p>
-      <w:pPr>
-        <w:pStyle w:val="ListBullet2"/>
-      </w:pPr>
-      <w:r>
-        <w:rPr>
-          <w:rFonts w:ascii="Consolas" w:hAnsi="Consolas"/>
-          <w:sz w:val="19"/>
-        </w:rPr>
-        <w:t>demo-lao-api</w:t>
+        <w:t>anh đã chốt 30/09: API riêng của anh Toàn.</w:t>
       </w:r>
       <w:r>
-        <w:t>, chung máy với kế toán anh Tune — em đề nghị cách này; hay</w:t>
-      </w:r>
-    </w:p>
-    <w:p>
-      <w:pPr>
-        <w:pStyle w:val="ListBullet2"/>
-      </w:pPr>
-      <w:r>
-        <w:t xml:space="preserve">một máy riêng chạy bản </w:t>
-      </w:r>
-      <w:r>
-        <w:rPr>
-          <w:rFonts w:ascii="Consolas" w:hAnsi="Consolas"/>
-          <w:sz w:val="19"/>
-        </w:rPr>
-        <w:t>Backend.API</w:t>
-      </w:r>
-      <w:r>
-        <w:t xml:space="preserve"> anh Toàn gửi?</w:t>
-      </w:r>
-    </w:p>
-    <w:p>
-      <w:pPr>
-        <w:jc w:val="both"/>
-      </w:pPr>
-      <w:r>
-        <w:t>Anh chốt với anh Toàn.</w:t>
+        <w:t xml:space="preserve"> Làm module anh Tune trước.</w:t>
       </w:r>
     </w:p>
     <w:sectPr>

</xml_diff>